<commit_message>
Reformat V14 script and image prompts to match V13 style exactly
- build_v14_final_script.py: SECTIONS structure, grey [N] beat numbers, red section headers,
  ElevenLabs PDF with clean narration only (no numbers, no section labels), font 12pt leading 20
- build_v14_final_image_prompts_pdf.py: KeepTogether blocks, STYLE prepended to each prompt,
  section headers in red, PART N DONE markers, same styles as V13 image prompts
- Regenerated: V14_final_SCRIPT.docx, V14_final_SCRIPT.pdf, V14_final_ELEVENLABS.pdf, V14_final_IMAGE_PROMPTS.pdf

Co-Authored-By: Claude Sonnet 4.6 <noreply@anthropic.com>
Claude-Session: https://claude.ai/code/session_01L4D3BJE5wxKGrRneu3Lana
</commit_message>
<xml_diff>
--- a/V14_final_SCRIPT.docx
+++ b/V14_final_SCRIPT.docx
@@ -9,10 +9,9 @@
       <w:r>
         <w:rPr>
           <w:b/>
-          <w:color w:val="B02A2A"/>
           <w:sz w:val="28"/>
         </w:rPr>
-        <w:t>NEUROCENTS — VIDEO 14</w:t>
+        <w:t>NEUROCENTS · VIDEO 14 — BRIEF v3.1</w:t>
       </w:r>
     </w:p>
     <w:p>
@@ -21,8 +20,22 @@
       </w:pPr>
       <w:r>
         <w:rPr>
-          <w:color w:val="2C3E50"/>
+          <w:b/>
+          <w:color w:val="B02A2A"/>
           <w:sz w:val="22"/>
+        </w:rPr>
+        <w:t>SCRIPT (NARRATION)</w:t>
+      </w:r>
+    </w:p>
+    <w:p>
+      <w:pPr>
+        <w:jc w:val="center"/>
+      </w:pPr>
+      <w:r>
+        <w:rPr>
+          <w:b/>
+          <w:i/>
+          <w:sz w:val="28"/>
         </w:rPr>
         <w:t>5 Things That Drain Your Money Before Payday (No Matter What You Earn)</w:t>
       </w:r>
@@ -33,38 +46,37 @@
       </w:pPr>
       <w:r>
         <w:rPr>
-          <w:color w:val="777777"/>
+          <w:color w:val="448844"/>
           <w:sz w:val="18"/>
         </w:rPr>
-        <w:t>95 beats · Hook S1 · Lista con Ranking · Sin datos científicos · CapCut static</w:t>
+        <w:t>Hook: S1 — Pregunta Sin Resolver · S17 Thumbnail Continuity · S18 Rotation ✅ · Lista con Ranking</w:t>
       </w:r>
     </w:p>
     <w:p/>
     <w:p>
       <w:pPr>
-        <w:spacing w:before="240" w:after="40"/>
+        <w:spacing w:before="280" w:after="80"/>
       </w:pPr>
       <w:r>
         <w:rPr>
           <w:b/>
           <w:color w:val="B02A2A"/>
-          <w:sz w:val="20"/>
+          <w:sz w:val="22"/>
         </w:rPr>
-        <w:t>── HOOK — PRIMEROS 5 SEGUNDOS ──</w:t>
+        <w:t>— HOOK — PRIMEROS 5 SEGUNDOS —</w:t>
       </w:r>
     </w:p>
     <w:p>
       <w:pPr>
-        <w:spacing w:before="20" w:after="60"/>
-        <w:ind w:left="283"/>
+        <w:spacing w:before="20" w:after="20"/>
       </w:pPr>
       <w:r>
         <w:rPr>
           <w:b/>
-          <w:color w:val="777777"/>
+          <w:color w:val="888888"/>
           <w:sz w:val="18"/>
         </w:rPr>
-        <w:t xml:space="preserve">[01]  </w:t>
+        <w:t xml:space="preserve">[1]  </w:t>
       </w:r>
       <w:r>
         <w:rPr>
@@ -75,29 +87,15 @@
     </w:p>
     <w:p>
       <w:pPr>
-        <w:spacing w:before="240" w:after="40"/>
+        <w:spacing w:before="20" w:after="20"/>
       </w:pPr>
       <w:r>
         <w:rPr>
           <w:b/>
-          <w:color w:val="B02A2A"/>
-          <w:sz w:val="20"/>
-        </w:rPr>
-        <w:t>── HOOK ──</w:t>
-      </w:r>
-    </w:p>
-    <w:p>
-      <w:pPr>
-        <w:spacing w:before="20" w:after="60"/>
-        <w:ind w:left="283"/>
-      </w:pPr>
-      <w:r>
-        <w:rPr>
-          <w:b/>
-          <w:color w:val="777777"/>
+          <w:color w:val="888888"/>
           <w:sz w:val="18"/>
         </w:rPr>
-        <w:t xml:space="preserve">[02]  </w:t>
+        <w:t xml:space="preserve">[2]  </w:t>
       </w:r>
       <w:r>
         <w:rPr>
@@ -108,16 +106,15 @@
     </w:p>
     <w:p>
       <w:pPr>
-        <w:spacing w:before="20" w:after="60"/>
-        <w:ind w:left="283"/>
+        <w:spacing w:before="20" w:after="20"/>
       </w:pPr>
       <w:r>
         <w:rPr>
           <w:b/>
-          <w:color w:val="777777"/>
+          <w:color w:val="888888"/>
           <w:sz w:val="18"/>
         </w:rPr>
-        <w:t xml:space="preserve">[03]  </w:t>
+        <w:t xml:space="preserve">[3]  </w:t>
       </w:r>
       <w:r>
         <w:rPr>
@@ -128,16 +125,15 @@
     </w:p>
     <w:p>
       <w:pPr>
-        <w:spacing w:before="20" w:after="60"/>
-        <w:ind w:left="283"/>
+        <w:spacing w:before="20" w:after="20"/>
       </w:pPr>
       <w:r>
         <w:rPr>
           <w:b/>
-          <w:color w:val="777777"/>
+          <w:color w:val="888888"/>
           <w:sz w:val="18"/>
         </w:rPr>
-        <w:t xml:space="preserve">[04]  </w:t>
+        <w:t xml:space="preserve">[4]  </w:t>
       </w:r>
       <w:r>
         <w:rPr>
@@ -148,16 +144,15 @@
     </w:p>
     <w:p>
       <w:pPr>
-        <w:spacing w:before="20" w:after="60"/>
-        <w:ind w:left="283"/>
+        <w:spacing w:before="20" w:after="20"/>
       </w:pPr>
       <w:r>
         <w:rPr>
           <w:b/>
-          <w:color w:val="777777"/>
+          <w:color w:val="888888"/>
           <w:sz w:val="18"/>
         </w:rPr>
-        <w:t xml:space="preserve">[05]  </w:t>
+        <w:t xml:space="preserve">[5]  </w:t>
       </w:r>
       <w:r>
         <w:rPr>
@@ -168,16 +163,15 @@
     </w:p>
     <w:p>
       <w:pPr>
-        <w:spacing w:before="20" w:after="60"/>
-        <w:ind w:left="283"/>
+        <w:spacing w:before="20" w:after="20"/>
       </w:pPr>
       <w:r>
         <w:rPr>
           <w:b/>
-          <w:color w:val="777777"/>
+          <w:color w:val="888888"/>
           <w:sz w:val="18"/>
         </w:rPr>
-        <w:t xml:space="preserve">[06]  </w:t>
+        <w:t xml:space="preserve">[6]  </w:t>
       </w:r>
       <w:r>
         <w:rPr>
@@ -188,16 +182,15 @@
     </w:p>
     <w:p>
       <w:pPr>
-        <w:spacing w:before="20" w:after="60"/>
-        <w:ind w:left="283"/>
+        <w:spacing w:before="20" w:after="20"/>
       </w:pPr>
       <w:r>
         <w:rPr>
           <w:b/>
-          <w:color w:val="777777"/>
+          <w:color w:val="888888"/>
           <w:sz w:val="18"/>
         </w:rPr>
-        <w:t xml:space="preserve">[07]  </w:t>
+        <w:t xml:space="preserve">[7]  </w:t>
       </w:r>
       <w:r>
         <w:rPr>
@@ -208,16 +201,15 @@
     </w:p>
     <w:p>
       <w:pPr>
-        <w:spacing w:before="20" w:after="60"/>
-        <w:ind w:left="283"/>
+        <w:spacing w:before="20" w:after="20"/>
       </w:pPr>
       <w:r>
         <w:rPr>
           <w:b/>
-          <w:color w:val="777777"/>
+          <w:color w:val="888888"/>
           <w:sz w:val="18"/>
         </w:rPr>
-        <w:t xml:space="preserve">[08]  </w:t>
+        <w:t xml:space="preserve">[8]  </w:t>
       </w:r>
       <w:r>
         <w:rPr>
@@ -226,31 +218,31 @@
         <w:t>Here's the list.</w:t>
       </w:r>
     </w:p>
+    <w:p/>
     <w:p>
       <w:pPr>
-        <w:spacing w:before="240" w:after="40"/>
+        <w:spacing w:before="280" w:after="80"/>
       </w:pPr>
       <w:r>
         <w:rPr>
           <w:b/>
           <w:color w:val="B02A2A"/>
-          <w:sz w:val="20"/>
+          <w:sz w:val="22"/>
         </w:rPr>
-        <w:t>── SETUP ──</w:t>
+        <w:t>— SETUP —</w:t>
       </w:r>
     </w:p>
     <w:p>
       <w:pPr>
-        <w:spacing w:before="20" w:after="60"/>
-        <w:ind w:left="283"/>
+        <w:spacing w:before="20" w:after="20"/>
       </w:pPr>
       <w:r>
         <w:rPr>
           <w:b/>
-          <w:color w:val="777777"/>
+          <w:color w:val="888888"/>
           <w:sz w:val="18"/>
         </w:rPr>
-        <w:t xml:space="preserve">[09]  </w:t>
+        <w:t xml:space="preserve">[9]  </w:t>
       </w:r>
       <w:r>
         <w:rPr>
@@ -261,13 +253,12 @@
     </w:p>
     <w:p>
       <w:pPr>
-        <w:spacing w:before="20" w:after="60"/>
-        <w:ind w:left="283"/>
+        <w:spacing w:before="20" w:after="20"/>
       </w:pPr>
       <w:r>
         <w:rPr>
           <w:b/>
-          <w:color w:val="777777"/>
+          <w:color w:val="888888"/>
           <w:sz w:val="18"/>
         </w:rPr>
         <w:t xml:space="preserve">[10]  </w:t>
@@ -281,13 +272,12 @@
     </w:p>
     <w:p>
       <w:pPr>
-        <w:spacing w:before="20" w:after="60"/>
-        <w:ind w:left="283"/>
+        <w:spacing w:before="20" w:after="20"/>
       </w:pPr>
       <w:r>
         <w:rPr>
           <w:b/>
-          <w:color w:val="777777"/>
+          <w:color w:val="888888"/>
           <w:sz w:val="18"/>
         </w:rPr>
         <w:t xml:space="preserve">[11]  </w:t>
@@ -301,13 +291,12 @@
     </w:p>
     <w:p>
       <w:pPr>
-        <w:spacing w:before="20" w:after="60"/>
-        <w:ind w:left="283"/>
+        <w:spacing w:before="20" w:after="20"/>
       </w:pPr>
       <w:r>
         <w:rPr>
           <w:b/>
-          <w:color w:val="777777"/>
+          <w:color w:val="888888"/>
           <w:sz w:val="18"/>
         </w:rPr>
         <w:t xml:space="preserve">[12]  </w:t>
@@ -319,28 +308,28 @@
         <w:t>Number five is the one everyone knows. And still can't stop.</w:t>
       </w:r>
     </w:p>
+    <w:p/>
     <w:p>
       <w:pPr>
-        <w:spacing w:before="240" w:after="40"/>
+        <w:spacing w:before="280" w:after="80"/>
       </w:pPr>
       <w:r>
         <w:rPr>
           <w:b/>
           <w:color w:val="B02A2A"/>
-          <w:sz w:val="20"/>
+          <w:sz w:val="22"/>
         </w:rPr>
-        <w:t>── ITEM 5 — THE CARD GAP ──</w:t>
+        <w:t>— ITEM 5 — THE CARD GAP —</w:t>
       </w:r>
     </w:p>
     <w:p>
       <w:pPr>
-        <w:spacing w:before="20" w:after="60"/>
-        <w:ind w:left="283"/>
+        <w:spacing w:before="20" w:after="20"/>
       </w:pPr>
       <w:r>
         <w:rPr>
           <w:b/>
-          <w:color w:val="777777"/>
+          <w:color w:val="888888"/>
           <w:sz w:val="18"/>
         </w:rPr>
         <w:t xml:space="preserve">[13]  </w:t>
@@ -354,26 +343,12 @@
     </w:p>
     <w:p>
       <w:pPr>
-        <w:spacing w:before="240" w:after="40"/>
+        <w:spacing w:before="20" w:after="20"/>
       </w:pPr>
       <w:r>
         <w:rPr>
           <w:b/>
-          <w:color w:val="B02A2A"/>
-          <w:sz w:val="20"/>
-        </w:rPr>
-        <w:t>── ITEM 5 ──</w:t>
-      </w:r>
-    </w:p>
-    <w:p>
-      <w:pPr>
-        <w:spacing w:before="20" w:after="60"/>
-        <w:ind w:left="283"/>
-      </w:pPr>
-      <w:r>
-        <w:rPr>
-          <w:b/>
-          <w:color w:val="777777"/>
+          <w:color w:val="888888"/>
           <w:sz w:val="18"/>
         </w:rPr>
         <w:t xml:space="preserve">[14]  </w:t>
@@ -387,13 +362,12 @@
     </w:p>
     <w:p>
       <w:pPr>
-        <w:spacing w:before="20" w:after="60"/>
-        <w:ind w:left="283"/>
+        <w:spacing w:before="20" w:after="20"/>
       </w:pPr>
       <w:r>
         <w:rPr>
           <w:b/>
-          <w:color w:val="777777"/>
+          <w:color w:val="888888"/>
           <w:sz w:val="18"/>
         </w:rPr>
         <w:t xml:space="preserve">[15]  </w:t>
@@ -407,13 +381,12 @@
     </w:p>
     <w:p>
       <w:pPr>
-        <w:spacing w:before="20" w:after="60"/>
-        <w:ind w:left="283"/>
+        <w:spacing w:before="20" w:after="20"/>
       </w:pPr>
       <w:r>
         <w:rPr>
           <w:b/>
-          <w:color w:val="777777"/>
+          <w:color w:val="888888"/>
           <w:sz w:val="18"/>
         </w:rPr>
         <w:t xml:space="preserve">[16]  </w:t>
@@ -427,13 +400,12 @@
     </w:p>
     <w:p>
       <w:pPr>
-        <w:spacing w:before="20" w:after="60"/>
-        <w:ind w:left="283"/>
+        <w:spacing w:before="20" w:after="20"/>
       </w:pPr>
       <w:r>
         <w:rPr>
           <w:b/>
-          <w:color w:val="777777"/>
+          <w:color w:val="888888"/>
           <w:sz w:val="18"/>
         </w:rPr>
         <w:t xml:space="preserve">[17]  </w:t>
@@ -447,13 +419,12 @@
     </w:p>
     <w:p>
       <w:pPr>
-        <w:spacing w:before="20" w:after="60"/>
-        <w:ind w:left="283"/>
+        <w:spacing w:before="20" w:after="20"/>
       </w:pPr>
       <w:r>
         <w:rPr>
           <w:b/>
-          <w:color w:val="777777"/>
+          <w:color w:val="888888"/>
           <w:sz w:val="18"/>
         </w:rPr>
         <w:t xml:space="preserve">[18]  </w:t>
@@ -467,13 +438,12 @@
     </w:p>
     <w:p>
       <w:pPr>
-        <w:spacing w:before="20" w:after="60"/>
-        <w:ind w:left="283"/>
+        <w:spacing w:before="20" w:after="20"/>
       </w:pPr>
       <w:r>
         <w:rPr>
           <w:b/>
-          <w:color w:val="777777"/>
+          <w:color w:val="888888"/>
           <w:sz w:val="18"/>
         </w:rPr>
         <w:t xml:space="preserve">[19]  </w:t>
@@ -487,13 +457,12 @@
     </w:p>
     <w:p>
       <w:pPr>
-        <w:spacing w:before="20" w:after="60"/>
-        <w:ind w:left="283"/>
+        <w:spacing w:before="20" w:after="20"/>
       </w:pPr>
       <w:r>
         <w:rPr>
           <w:b/>
-          <w:color w:val="777777"/>
+          <w:color w:val="888888"/>
           <w:sz w:val="18"/>
         </w:rPr>
         <w:t xml:space="preserve">[20]  </w:t>
@@ -505,28 +474,28 @@
         <w:t>Your brain is still waiting for the money to actually leave.</w:t>
       </w:r>
     </w:p>
+    <w:p/>
     <w:p>
       <w:pPr>
-        <w:spacing w:before="240" w:after="40"/>
+        <w:spacing w:before="280" w:after="80"/>
       </w:pPr>
       <w:r>
         <w:rPr>
           <w:b/>
           <w:color w:val="B02A2A"/>
-          <w:sz w:val="20"/>
+          <w:sz w:val="22"/>
         </w:rPr>
-        <w:t>── ITEM 4 — THE REWARD DRAIN ──</w:t>
+        <w:t>— ITEM 4 — THE REWARD DRAIN —</w:t>
       </w:r>
     </w:p>
     <w:p>
       <w:pPr>
-        <w:spacing w:before="20" w:after="60"/>
-        <w:ind w:left="283"/>
+        <w:spacing w:before="20" w:after="20"/>
       </w:pPr>
       <w:r>
         <w:rPr>
           <w:b/>
-          <w:color w:val="777777"/>
+          <w:color w:val="888888"/>
           <w:sz w:val="18"/>
         </w:rPr>
         <w:t xml:space="preserve">[21]  </w:t>
@@ -540,26 +509,12 @@
     </w:p>
     <w:p>
       <w:pPr>
-        <w:spacing w:before="240" w:after="40"/>
+        <w:spacing w:before="20" w:after="20"/>
       </w:pPr>
       <w:r>
         <w:rPr>
           <w:b/>
-          <w:color w:val="B02A2A"/>
-          <w:sz w:val="20"/>
-        </w:rPr>
-        <w:t>── ITEM 4 ──</w:t>
-      </w:r>
-    </w:p>
-    <w:p>
-      <w:pPr>
-        <w:spacing w:before="20" w:after="60"/>
-        <w:ind w:left="283"/>
-      </w:pPr>
-      <w:r>
-        <w:rPr>
-          <w:b/>
-          <w:color w:val="777777"/>
+          <w:color w:val="888888"/>
           <w:sz w:val="18"/>
         </w:rPr>
         <w:t xml:space="preserve">[22]  </w:t>
@@ -573,13 +528,12 @@
     </w:p>
     <w:p>
       <w:pPr>
-        <w:spacing w:before="20" w:after="60"/>
-        <w:ind w:left="283"/>
+        <w:spacing w:before="20" w:after="20"/>
       </w:pPr>
       <w:r>
         <w:rPr>
           <w:b/>
-          <w:color w:val="777777"/>
+          <w:color w:val="888888"/>
           <w:sz w:val="18"/>
         </w:rPr>
         <w:t xml:space="preserve">[23]  </w:t>
@@ -593,13 +547,12 @@
     </w:p>
     <w:p>
       <w:pPr>
-        <w:spacing w:before="20" w:after="60"/>
-        <w:ind w:left="283"/>
+        <w:spacing w:before="20" w:after="20"/>
       </w:pPr>
       <w:r>
         <w:rPr>
           <w:b/>
-          <w:color w:val="777777"/>
+          <w:color w:val="888888"/>
           <w:sz w:val="18"/>
         </w:rPr>
         <w:t xml:space="preserve">[24]  </w:t>
@@ -613,13 +566,12 @@
     </w:p>
     <w:p>
       <w:pPr>
-        <w:spacing w:before="20" w:after="60"/>
-        <w:ind w:left="283"/>
+        <w:spacing w:before="20" w:after="20"/>
       </w:pPr>
       <w:r>
         <w:rPr>
           <w:b/>
-          <w:color w:val="777777"/>
+          <w:color w:val="888888"/>
           <w:sz w:val="18"/>
         </w:rPr>
         <w:t xml:space="preserve">[25]  </w:t>
@@ -633,13 +585,12 @@
     </w:p>
     <w:p>
       <w:pPr>
-        <w:spacing w:before="20" w:after="60"/>
-        <w:ind w:left="283"/>
+        <w:spacing w:before="20" w:after="20"/>
       </w:pPr>
       <w:r>
         <w:rPr>
           <w:b/>
-          <w:color w:val="777777"/>
+          <w:color w:val="888888"/>
           <w:sz w:val="18"/>
         </w:rPr>
         <w:t xml:space="preserve">[26]  </w:t>
@@ -653,13 +604,12 @@
     </w:p>
     <w:p>
       <w:pPr>
-        <w:spacing w:before="20" w:after="60"/>
-        <w:ind w:left="283"/>
+        <w:spacing w:before="20" w:after="20"/>
       </w:pPr>
       <w:r>
         <w:rPr>
           <w:b/>
-          <w:color w:val="777777"/>
+          <w:color w:val="888888"/>
           <w:sz w:val="18"/>
         </w:rPr>
         <w:t xml:space="preserve">[27]  </w:t>
@@ -673,13 +623,12 @@
     </w:p>
     <w:p>
       <w:pPr>
-        <w:spacing w:before="20" w:after="60"/>
-        <w:ind w:left="283"/>
+        <w:spacing w:before="20" w:after="20"/>
       </w:pPr>
       <w:r>
         <w:rPr>
           <w:b/>
-          <w:color w:val="777777"/>
+          <w:color w:val="888888"/>
           <w:sz w:val="18"/>
         </w:rPr>
         <w:t xml:space="preserve">[28]  </w:t>
@@ -691,28 +640,28 @@
         <w:t>That sentence has cost more money than any impulse purchase.</w:t>
       </w:r>
     </w:p>
+    <w:p/>
     <w:p>
       <w:pPr>
-        <w:spacing w:before="240" w:after="40"/>
+        <w:spacing w:before="280" w:after="80"/>
       </w:pPr>
       <w:r>
         <w:rPr>
           <w:b/>
           <w:color w:val="B02A2A"/>
-          <w:sz w:val="20"/>
+          <w:sz w:val="22"/>
         </w:rPr>
-        <w:t>── ITEM 3 — THE INVISIBLE DRAIN ──</w:t>
+        <w:t>— ITEM 3 — THE INVISIBLE DRAIN —</w:t>
       </w:r>
     </w:p>
     <w:p>
       <w:pPr>
-        <w:spacing w:before="20" w:after="60"/>
-        <w:ind w:left="283"/>
+        <w:spacing w:before="20" w:after="20"/>
       </w:pPr>
       <w:r>
         <w:rPr>
           <w:b/>
-          <w:color w:val="777777"/>
+          <w:color w:val="888888"/>
           <w:sz w:val="18"/>
         </w:rPr>
         <w:t xml:space="preserve">[29]  </w:t>
@@ -726,26 +675,12 @@
     </w:p>
     <w:p>
       <w:pPr>
-        <w:spacing w:before="240" w:after="40"/>
+        <w:spacing w:before="20" w:after="20"/>
       </w:pPr>
       <w:r>
         <w:rPr>
           <w:b/>
-          <w:color w:val="B02A2A"/>
-          <w:sz w:val="20"/>
-        </w:rPr>
-        <w:t>── ITEM 3 ──</w:t>
-      </w:r>
-    </w:p>
-    <w:p>
-      <w:pPr>
-        <w:spacing w:before="20" w:after="60"/>
-        <w:ind w:left="283"/>
-      </w:pPr>
-      <w:r>
-        <w:rPr>
-          <w:b/>
-          <w:color w:val="777777"/>
+          <w:color w:val="888888"/>
           <w:sz w:val="18"/>
         </w:rPr>
         <w:t xml:space="preserve">[30]  </w:t>
@@ -759,13 +694,12 @@
     </w:p>
     <w:p>
       <w:pPr>
-        <w:spacing w:before="20" w:after="60"/>
-        <w:ind w:left="283"/>
+        <w:spacing w:before="20" w:after="20"/>
       </w:pPr>
       <w:r>
         <w:rPr>
           <w:b/>
-          <w:color w:val="777777"/>
+          <w:color w:val="888888"/>
           <w:sz w:val="18"/>
         </w:rPr>
         <w:t xml:space="preserve">[31]  </w:t>
@@ -779,13 +713,12 @@
     </w:p>
     <w:p>
       <w:pPr>
-        <w:spacing w:before="20" w:after="60"/>
-        <w:ind w:left="283"/>
+        <w:spacing w:before="20" w:after="20"/>
       </w:pPr>
       <w:r>
         <w:rPr>
           <w:b/>
-          <w:color w:val="777777"/>
+          <w:color w:val="888888"/>
           <w:sz w:val="18"/>
         </w:rPr>
         <w:t xml:space="preserve">[32]  </w:t>
@@ -799,13 +732,12 @@
     </w:p>
     <w:p>
       <w:pPr>
-        <w:spacing w:before="20" w:after="60"/>
-        <w:ind w:left="283"/>
+        <w:spacing w:before="20" w:after="20"/>
       </w:pPr>
       <w:r>
         <w:rPr>
           <w:b/>
-          <w:color w:val="777777"/>
+          <w:color w:val="888888"/>
           <w:sz w:val="18"/>
         </w:rPr>
         <w:t xml:space="preserve">[33]  </w:t>
@@ -819,13 +751,12 @@
     </w:p>
     <w:p>
       <w:pPr>
-        <w:spacing w:before="20" w:after="60"/>
-        <w:ind w:left="283"/>
+        <w:spacing w:before="20" w:after="20"/>
       </w:pPr>
       <w:r>
         <w:rPr>
           <w:b/>
-          <w:color w:val="777777"/>
+          <w:color w:val="888888"/>
           <w:sz w:val="18"/>
         </w:rPr>
         <w:t xml:space="preserve">[34]  </w:t>
@@ -839,13 +770,12 @@
     </w:p>
     <w:p>
       <w:pPr>
-        <w:spacing w:before="20" w:after="60"/>
-        <w:ind w:left="283"/>
+        <w:spacing w:before="20" w:after="20"/>
       </w:pPr>
       <w:r>
         <w:rPr>
           <w:b/>
-          <w:color w:val="777777"/>
+          <w:color w:val="888888"/>
           <w:sz w:val="18"/>
         </w:rPr>
         <w:t xml:space="preserve">[35]  </w:t>
@@ -857,28 +787,28 @@
         <w:t>Your brain doesn't cancel things. It lets them run.</w:t>
       </w:r>
     </w:p>
+    <w:p/>
     <w:p>
       <w:pPr>
-        <w:spacing w:before="240" w:after="40"/>
+        <w:spacing w:before="280" w:after="80"/>
       </w:pPr>
       <w:r>
         <w:rPr>
           <w:b/>
           <w:color w:val="B02A2A"/>
-          <w:sz w:val="20"/>
+          <w:sz w:val="22"/>
         </w:rPr>
-        <w:t>── CTA ──</w:t>
+        <w:t>— CTA —</w:t>
       </w:r>
     </w:p>
     <w:p>
       <w:pPr>
-        <w:spacing w:before="20" w:after="60"/>
-        <w:ind w:left="283"/>
+        <w:spacing w:before="20" w:after="20"/>
       </w:pPr>
       <w:r>
         <w:rPr>
           <w:b/>
-          <w:color w:val="777777"/>
+          <w:color w:val="888888"/>
           <w:sz w:val="18"/>
         </w:rPr>
         <w:t xml:space="preserve">[36]  </w:t>
@@ -892,13 +822,12 @@
     </w:p>
     <w:p>
       <w:pPr>
-        <w:spacing w:before="20" w:after="60"/>
-        <w:ind w:left="283"/>
+        <w:spacing w:before="20" w:after="20"/>
       </w:pPr>
       <w:r>
         <w:rPr>
           <w:b/>
-          <w:color w:val="777777"/>
+          <w:color w:val="888888"/>
           <w:sz w:val="18"/>
         </w:rPr>
         <w:t xml:space="preserve">[37]  </w:t>
@@ -910,28 +839,28 @@
         <w:t>We break down a new pattern every week. It's free. And it might save you more than you think.</w:t>
       </w:r>
     </w:p>
+    <w:p/>
     <w:p>
       <w:pPr>
-        <w:spacing w:before="240" w:after="40"/>
+        <w:spacing w:before="280" w:after="80"/>
       </w:pPr>
       <w:r>
         <w:rPr>
           <w:b/>
           <w:color w:val="B02A2A"/>
-          <w:sz w:val="20"/>
+          <w:sz w:val="22"/>
         </w:rPr>
-        <w:t>── ITEM 2 — SOCIAL SPENDING ──</w:t>
+        <w:t>— ITEM 2 — SOCIAL SPENDING —</w:t>
       </w:r>
     </w:p>
     <w:p>
       <w:pPr>
-        <w:spacing w:before="20" w:after="60"/>
-        <w:ind w:left="283"/>
+        <w:spacing w:before="20" w:after="20"/>
       </w:pPr>
       <w:r>
         <w:rPr>
           <w:b/>
-          <w:color w:val="777777"/>
+          <w:color w:val="888888"/>
           <w:sz w:val="18"/>
         </w:rPr>
         <w:t xml:space="preserve">[38]  </w:t>
@@ -945,26 +874,12 @@
     </w:p>
     <w:p>
       <w:pPr>
-        <w:spacing w:before="240" w:after="40"/>
+        <w:spacing w:before="20" w:after="20"/>
       </w:pPr>
       <w:r>
         <w:rPr>
           <w:b/>
-          <w:color w:val="B02A2A"/>
-          <w:sz w:val="20"/>
-        </w:rPr>
-        <w:t>── ITEM 2 ──</w:t>
-      </w:r>
-    </w:p>
-    <w:p>
-      <w:pPr>
-        <w:spacing w:before="20" w:after="60"/>
-        <w:ind w:left="283"/>
-      </w:pPr>
-      <w:r>
-        <w:rPr>
-          <w:b/>
-          <w:color w:val="777777"/>
+          <w:color w:val="888888"/>
           <w:sz w:val="18"/>
         </w:rPr>
         <w:t xml:space="preserve">[39]  </w:t>
@@ -978,13 +893,12 @@
     </w:p>
     <w:p>
       <w:pPr>
-        <w:spacing w:before="20" w:after="60"/>
-        <w:ind w:left="283"/>
+        <w:spacing w:before="20" w:after="20"/>
       </w:pPr>
       <w:r>
         <w:rPr>
           <w:b/>
-          <w:color w:val="777777"/>
+          <w:color w:val="888888"/>
           <w:sz w:val="18"/>
         </w:rPr>
         <w:t xml:space="preserve">[40]  </w:t>
@@ -998,13 +912,12 @@
     </w:p>
     <w:p>
       <w:pPr>
-        <w:spacing w:before="20" w:after="60"/>
-        <w:ind w:left="283"/>
+        <w:spacing w:before="20" w:after="20"/>
       </w:pPr>
       <w:r>
         <w:rPr>
           <w:b/>
-          <w:color w:val="777777"/>
+          <w:color w:val="888888"/>
           <w:sz w:val="18"/>
         </w:rPr>
         <w:t xml:space="preserve">[41]  </w:t>
@@ -1018,13 +931,12 @@
     </w:p>
     <w:p>
       <w:pPr>
-        <w:spacing w:before="20" w:after="60"/>
-        <w:ind w:left="283"/>
+        <w:spacing w:before="20" w:after="20"/>
       </w:pPr>
       <w:r>
         <w:rPr>
           <w:b/>
-          <w:color w:val="777777"/>
+          <w:color w:val="888888"/>
           <w:sz w:val="18"/>
         </w:rPr>
         <w:t xml:space="preserve">[42]  </w:t>
@@ -1038,13 +950,12 @@
     </w:p>
     <w:p>
       <w:pPr>
-        <w:spacing w:before="20" w:after="60"/>
-        <w:ind w:left="283"/>
+        <w:spacing w:before="20" w:after="20"/>
       </w:pPr>
       <w:r>
         <w:rPr>
           <w:b/>
-          <w:color w:val="777777"/>
+          <w:color w:val="888888"/>
           <w:sz w:val="18"/>
         </w:rPr>
         <w:t xml:space="preserve">[43]  </w:t>
@@ -1058,13 +969,12 @@
     </w:p>
     <w:p>
       <w:pPr>
-        <w:spacing w:before="20" w:after="60"/>
-        <w:ind w:left="283"/>
+        <w:spacing w:before="20" w:after="20"/>
       </w:pPr>
       <w:r>
         <w:rPr>
           <w:b/>
-          <w:color w:val="777777"/>
+          <w:color w:val="888888"/>
           <w:sz w:val="18"/>
         </w:rPr>
         <w:t xml:space="preserve">[44]  </w:t>
@@ -1078,13 +988,12 @@
     </w:p>
     <w:p>
       <w:pPr>
-        <w:spacing w:before="20" w:after="60"/>
-        <w:ind w:left="283"/>
+        <w:spacing w:before="20" w:after="20"/>
       </w:pPr>
       <w:r>
         <w:rPr>
           <w:b/>
-          <w:color w:val="777777"/>
+          <w:color w:val="888888"/>
           <w:sz w:val="18"/>
         </w:rPr>
         <w:t xml:space="preserve">[45]  </w:t>
@@ -1098,13 +1007,12 @@
     </w:p>
     <w:p>
       <w:pPr>
-        <w:spacing w:before="20" w:after="60"/>
-        <w:ind w:left="283"/>
+        <w:spacing w:before="20" w:after="20"/>
       </w:pPr>
       <w:r>
         <w:rPr>
           <w:b/>
-          <w:color w:val="777777"/>
+          <w:color w:val="888888"/>
           <w:sz w:val="18"/>
         </w:rPr>
         <w:t xml:space="preserve">[46]  </w:t>
@@ -1116,28 +1024,28 @@
         <w:t>They live entirely in your head. And they have expensive taste.</w:t>
       </w:r>
     </w:p>
+    <w:p/>
     <w:p>
       <w:pPr>
-        <w:spacing w:before="240" w:after="40"/>
+        <w:spacing w:before="280" w:after="80"/>
       </w:pPr>
       <w:r>
         <w:rPr>
           <w:b/>
           <w:color w:val="B02A2A"/>
-          <w:sz w:val="20"/>
+          <w:sz w:val="22"/>
         </w:rPr>
-        <w:t>── ITEM 1 — THE PRE-SPEND ──</w:t>
+        <w:t>— ITEM 1 — THE PRE-SPEND —</w:t>
       </w:r>
     </w:p>
     <w:p>
       <w:pPr>
-        <w:spacing w:before="20" w:after="60"/>
-        <w:ind w:left="283"/>
+        <w:spacing w:before="20" w:after="20"/>
       </w:pPr>
       <w:r>
         <w:rPr>
           <w:b/>
-          <w:color w:val="777777"/>
+          <w:color w:val="888888"/>
           <w:sz w:val="18"/>
         </w:rPr>
         <w:t xml:space="preserve">[47]  </w:t>
@@ -1151,26 +1059,12 @@
     </w:p>
     <w:p>
       <w:pPr>
-        <w:spacing w:before="240" w:after="40"/>
+        <w:spacing w:before="20" w:after="20"/>
       </w:pPr>
       <w:r>
         <w:rPr>
           <w:b/>
-          <w:color w:val="B02A2A"/>
-          <w:sz w:val="20"/>
-        </w:rPr>
-        <w:t>── ITEM 1 ──</w:t>
-      </w:r>
-    </w:p>
-    <w:p>
-      <w:pPr>
-        <w:spacing w:before="20" w:after="60"/>
-        <w:ind w:left="283"/>
-      </w:pPr>
-      <w:r>
-        <w:rPr>
-          <w:b/>
-          <w:color w:val="777777"/>
+          <w:color w:val="888888"/>
           <w:sz w:val="18"/>
         </w:rPr>
         <w:t xml:space="preserve">[48]  </w:t>
@@ -1184,13 +1078,12 @@
     </w:p>
     <w:p>
       <w:pPr>
-        <w:spacing w:before="20" w:after="60"/>
-        <w:ind w:left="283"/>
+        <w:spacing w:before="20" w:after="20"/>
       </w:pPr>
       <w:r>
         <w:rPr>
           <w:b/>
-          <w:color w:val="777777"/>
+          <w:color w:val="888888"/>
           <w:sz w:val="18"/>
         </w:rPr>
         <w:t xml:space="preserve">[49]  </w:t>
@@ -1204,13 +1097,12 @@
     </w:p>
     <w:p>
       <w:pPr>
-        <w:spacing w:before="20" w:after="60"/>
-        <w:ind w:left="283"/>
+        <w:spacing w:before="20" w:after="20"/>
       </w:pPr>
       <w:r>
         <w:rPr>
           <w:b/>
-          <w:color w:val="777777"/>
+          <w:color w:val="888888"/>
           <w:sz w:val="18"/>
         </w:rPr>
         <w:t xml:space="preserve">[50]  </w:t>
@@ -1224,13 +1116,12 @@
     </w:p>
     <w:p>
       <w:pPr>
-        <w:spacing w:before="20" w:after="60"/>
-        <w:ind w:left="283"/>
+        <w:spacing w:before="20" w:after="20"/>
       </w:pPr>
       <w:r>
         <w:rPr>
           <w:b/>
-          <w:color w:val="777777"/>
+          <w:color w:val="888888"/>
           <w:sz w:val="18"/>
         </w:rPr>
         <w:t xml:space="preserve">[51]  </w:t>
@@ -1244,13 +1135,12 @@
     </w:p>
     <w:p>
       <w:pPr>
-        <w:spacing w:before="20" w:after="60"/>
-        <w:ind w:left="283"/>
+        <w:spacing w:before="20" w:after="20"/>
       </w:pPr>
       <w:r>
         <w:rPr>
           <w:b/>
-          <w:color w:val="777777"/>
+          <w:color w:val="888888"/>
           <w:sz w:val="18"/>
         </w:rPr>
         <w:t xml:space="preserve">[52]  </w:t>
@@ -1264,13 +1154,12 @@
     </w:p>
     <w:p>
       <w:pPr>
-        <w:spacing w:before="20" w:after="60"/>
-        <w:ind w:left="283"/>
+        <w:spacing w:before="20" w:after="20"/>
       </w:pPr>
       <w:r>
         <w:rPr>
           <w:b/>
-          <w:color w:val="777777"/>
+          <w:color w:val="888888"/>
           <w:sz w:val="18"/>
         </w:rPr>
         <w:t xml:space="preserve">[53]  </w:t>
@@ -1284,13 +1173,12 @@
     </w:p>
     <w:p>
       <w:pPr>
-        <w:spacing w:before="20" w:after="60"/>
-        <w:ind w:left="283"/>
+        <w:spacing w:before="20" w:after="20"/>
       </w:pPr>
       <w:r>
         <w:rPr>
           <w:b/>
-          <w:color w:val="777777"/>
+          <w:color w:val="888888"/>
           <w:sz w:val="18"/>
         </w:rPr>
         <w:t xml:space="preserve">[54]  </w:t>
@@ -1304,13 +1192,12 @@
     </w:p>
     <w:p>
       <w:pPr>
-        <w:spacing w:before="20" w:after="60"/>
-        <w:ind w:left="283"/>
+        <w:spacing w:before="20" w:after="20"/>
       </w:pPr>
       <w:r>
         <w:rPr>
           <w:b/>
-          <w:color w:val="777777"/>
+          <w:color w:val="888888"/>
           <w:sz w:val="18"/>
         </w:rPr>
         <w:t xml:space="preserve">[55]  </w:t>
@@ -1324,13 +1211,12 @@
     </w:p>
     <w:p>
       <w:pPr>
-        <w:spacing w:before="20" w:after="60"/>
-        <w:ind w:left="283"/>
+        <w:spacing w:before="20" w:after="20"/>
       </w:pPr>
       <w:r>
         <w:rPr>
           <w:b/>
-          <w:color w:val="777777"/>
+          <w:color w:val="888888"/>
           <w:sz w:val="18"/>
         </w:rPr>
         <w:t xml:space="preserve">[56]  </w:t>
@@ -1344,13 +1230,12 @@
     </w:p>
     <w:p>
       <w:pPr>
-        <w:spacing w:before="20" w:after="60"/>
-        <w:ind w:left="283"/>
+        <w:spacing w:before="20" w:after="20"/>
       </w:pPr>
       <w:r>
         <w:rPr>
           <w:b/>
-          <w:color w:val="777777"/>
+          <w:color w:val="888888"/>
           <w:sz w:val="18"/>
         </w:rPr>
         <w:t xml:space="preserve">[57]  </w:t>
@@ -1364,13 +1249,12 @@
     </w:p>
     <w:p>
       <w:pPr>
-        <w:spacing w:before="20" w:after="60"/>
-        <w:ind w:left="283"/>
+        <w:spacing w:before="20" w:after="20"/>
       </w:pPr>
       <w:r>
         <w:rPr>
           <w:b/>
-          <w:color w:val="777777"/>
+          <w:color w:val="888888"/>
           <w:sz w:val="18"/>
         </w:rPr>
         <w:t xml:space="preserve">[58]  </w:t>
@@ -1382,28 +1266,28 @@
         <w:t>You don't spend your salary. You process a transaction your brain closed on Wednesday.</w:t>
       </w:r>
     </w:p>
+    <w:p/>
     <w:p>
       <w:pPr>
-        <w:spacing w:before="240" w:after="40"/>
+        <w:spacing w:before="280" w:after="80"/>
       </w:pPr>
       <w:r>
         <w:rPr>
           <w:b/>
           <w:color w:val="B02A2A"/>
-          <w:sz w:val="20"/>
+          <w:sz w:val="22"/>
         </w:rPr>
-        <w:t>── MECHANISM CONCLUSION ──</w:t>
+        <w:t>— MECHANISM CONCLUSION —</w:t>
       </w:r>
     </w:p>
     <w:p>
       <w:pPr>
-        <w:spacing w:before="20" w:after="60"/>
-        <w:ind w:left="283"/>
+        <w:spacing w:before="20" w:after="20"/>
       </w:pPr>
       <w:r>
         <w:rPr>
           <w:b/>
-          <w:color w:val="777777"/>
+          <w:color w:val="888888"/>
           <w:sz w:val="18"/>
         </w:rPr>
         <w:t xml:space="preserve">[59]  </w:t>
@@ -1417,13 +1301,12 @@
     </w:p>
     <w:p>
       <w:pPr>
-        <w:spacing w:before="20" w:after="60"/>
-        <w:ind w:left="283"/>
+        <w:spacing w:before="20" w:after="20"/>
       </w:pPr>
       <w:r>
         <w:rPr>
           <w:b/>
-          <w:color w:val="777777"/>
+          <w:color w:val="888888"/>
           <w:sz w:val="18"/>
         </w:rPr>
         <w:t xml:space="preserve">[60]  </w:t>
@@ -1437,13 +1320,12 @@
     </w:p>
     <w:p>
       <w:pPr>
-        <w:spacing w:before="20" w:after="60"/>
-        <w:ind w:left="283"/>
+        <w:spacing w:before="20" w:after="20"/>
       </w:pPr>
       <w:r>
         <w:rPr>
           <w:b/>
-          <w:color w:val="777777"/>
+          <w:color w:val="888888"/>
           <w:sz w:val="18"/>
         </w:rPr>
         <w:t xml:space="preserve">[61]  </w:t>
@@ -1457,13 +1339,12 @@
     </w:p>
     <w:p>
       <w:pPr>
-        <w:spacing w:before="20" w:after="60"/>
-        <w:ind w:left="283"/>
+        <w:spacing w:before="20" w:after="20"/>
       </w:pPr>
       <w:r>
         <w:rPr>
           <w:b/>
-          <w:color w:val="777777"/>
+          <w:color w:val="888888"/>
           <w:sz w:val="18"/>
         </w:rPr>
         <w:t xml:space="preserve">[62]  </w:t>
@@ -1477,13 +1358,12 @@
     </w:p>
     <w:p>
       <w:pPr>
-        <w:spacing w:before="20" w:after="60"/>
-        <w:ind w:left="283"/>
+        <w:spacing w:before="20" w:after="20"/>
       </w:pPr>
       <w:r>
         <w:rPr>
           <w:b/>
-          <w:color w:val="777777"/>
+          <w:color w:val="888888"/>
           <w:sz w:val="18"/>
         </w:rPr>
         <w:t xml:space="preserve">[63]  </w:t>
@@ -1495,28 +1375,28 @@
         <w:t>The Reward Drain feels earned. The Social Spend feels reasonable. The Pre-Spend feels like planning.</w:t>
       </w:r>
     </w:p>
+    <w:p/>
     <w:p>
       <w:pPr>
-        <w:spacing w:before="240" w:after="40"/>
+        <w:spacing w:before="280" w:after="80"/>
       </w:pPr>
       <w:r>
         <w:rPr>
           <w:b/>
           <w:color w:val="B02A2A"/>
-          <w:sz w:val="20"/>
+          <w:sz w:val="22"/>
         </w:rPr>
-        <w:t>── THE STRUCTURAL FIX ──</w:t>
+        <w:t>— THE STRUCTURAL FIX —</w:t>
       </w:r>
     </w:p>
     <w:p>
       <w:pPr>
-        <w:spacing w:before="20" w:after="60"/>
-        <w:ind w:left="283"/>
+        <w:spacing w:before="20" w:after="20"/>
       </w:pPr>
       <w:r>
         <w:rPr>
           <w:b/>
-          <w:color w:val="777777"/>
+          <w:color w:val="888888"/>
           <w:sz w:val="18"/>
         </w:rPr>
         <w:t xml:space="preserve">[64]  </w:t>
@@ -1530,13 +1410,12 @@
     </w:p>
     <w:p>
       <w:pPr>
-        <w:spacing w:before="20" w:after="60"/>
-        <w:ind w:left="283"/>
+        <w:spacing w:before="20" w:after="20"/>
       </w:pPr>
       <w:r>
         <w:rPr>
           <w:b/>
-          <w:color w:val="777777"/>
+          <w:color w:val="888888"/>
           <w:sz w:val="18"/>
         </w:rPr>
         <w:t xml:space="preserve">[65]  </w:t>
@@ -1550,13 +1429,12 @@
     </w:p>
     <w:p>
       <w:pPr>
-        <w:spacing w:before="20" w:after="60"/>
-        <w:ind w:left="283"/>
+        <w:spacing w:before="20" w:after="20"/>
       </w:pPr>
       <w:r>
         <w:rPr>
           <w:b/>
-          <w:color w:val="777777"/>
+          <w:color w:val="888888"/>
           <w:sz w:val="18"/>
         </w:rPr>
         <w:t xml:space="preserve">[66]  </w:t>
@@ -1570,13 +1448,12 @@
     </w:p>
     <w:p>
       <w:pPr>
-        <w:spacing w:before="20" w:after="60"/>
-        <w:ind w:left="283"/>
+        <w:spacing w:before="20" w:after="20"/>
       </w:pPr>
       <w:r>
         <w:rPr>
           <w:b/>
-          <w:color w:val="777777"/>
+          <w:color w:val="888888"/>
           <w:sz w:val="18"/>
         </w:rPr>
         <w:t xml:space="preserve">[67]  </w:t>
@@ -1590,13 +1467,12 @@
     </w:p>
     <w:p>
       <w:pPr>
-        <w:spacing w:before="20" w:after="60"/>
-        <w:ind w:left="283"/>
+        <w:spacing w:before="20" w:after="20"/>
       </w:pPr>
       <w:r>
         <w:rPr>
           <w:b/>
-          <w:color w:val="777777"/>
+          <w:color w:val="888888"/>
           <w:sz w:val="18"/>
         </w:rPr>
         <w:t xml:space="preserve">[68]  </w:t>
@@ -1610,13 +1486,12 @@
     </w:p>
     <w:p>
       <w:pPr>
-        <w:spacing w:before="20" w:after="60"/>
-        <w:ind w:left="283"/>
+        <w:spacing w:before="20" w:after="20"/>
       </w:pPr>
       <w:r>
         <w:rPr>
           <w:b/>
-          <w:color w:val="777777"/>
+          <w:color w:val="888888"/>
           <w:sz w:val="18"/>
         </w:rPr>
         <w:t xml:space="preserve">[69]  </w:t>
@@ -1630,13 +1505,12 @@
     </w:p>
     <w:p>
       <w:pPr>
-        <w:spacing w:before="20" w:after="60"/>
-        <w:ind w:left="283"/>
+        <w:spacing w:before="20" w:after="20"/>
       </w:pPr>
       <w:r>
         <w:rPr>
           <w:b/>
-          <w:color w:val="777777"/>
+          <w:color w:val="888888"/>
           <w:sz w:val="18"/>
         </w:rPr>
         <w:t xml:space="preserve">[70]  </w:t>
@@ -1650,13 +1524,12 @@
     </w:p>
     <w:p>
       <w:pPr>
-        <w:spacing w:before="20" w:after="60"/>
-        <w:ind w:left="283"/>
+        <w:spacing w:before="20" w:after="20"/>
       </w:pPr>
       <w:r>
         <w:rPr>
           <w:b/>
-          <w:color w:val="777777"/>
+          <w:color w:val="888888"/>
           <w:sz w:val="18"/>
         </w:rPr>
         <w:t xml:space="preserve">[71]  </w:t>
@@ -1670,13 +1543,12 @@
     </w:p>
     <w:p>
       <w:pPr>
-        <w:spacing w:before="20" w:after="60"/>
-        <w:ind w:left="283"/>
+        <w:spacing w:before="20" w:after="20"/>
       </w:pPr>
       <w:r>
         <w:rPr>
           <w:b/>
-          <w:color w:val="777777"/>
+          <w:color w:val="888888"/>
           <w:sz w:val="18"/>
         </w:rPr>
         <w:t xml:space="preserve">[72]  </w:t>
@@ -1690,13 +1562,12 @@
     </w:p>
     <w:p>
       <w:pPr>
-        <w:spacing w:before="20" w:after="60"/>
-        <w:ind w:left="283"/>
+        <w:spacing w:before="20" w:after="20"/>
       </w:pPr>
       <w:r>
         <w:rPr>
           <w:b/>
-          <w:color w:val="777777"/>
+          <w:color w:val="888888"/>
           <w:sz w:val="18"/>
         </w:rPr>
         <w:t xml:space="preserve">[73]  </w:t>
@@ -1708,28 +1579,28 @@
         <w:t>For the Pre-Spend: the salary hits the account. You don't touch it for 24 hours.</w:t>
       </w:r>
     </w:p>
+    <w:p/>
     <w:p>
       <w:pPr>
-        <w:spacing w:before="240" w:after="40"/>
+        <w:spacing w:before="280" w:after="80"/>
       </w:pPr>
       <w:r>
         <w:rPr>
           <w:b/>
           <w:color w:val="B02A2A"/>
-          <w:sz w:val="20"/>
+          <w:sz w:val="22"/>
         </w:rPr>
-        <w:t>── BRAIN VILLAIN'S LAST TRICK ──</w:t>
+        <w:t>— BRAIN VILLAIN'S LAST TRICK —</w:t>
       </w:r>
     </w:p>
     <w:p>
       <w:pPr>
-        <w:spacing w:before="20" w:after="60"/>
-        <w:ind w:left="283"/>
+        <w:spacing w:before="20" w:after="20"/>
       </w:pPr>
       <w:r>
         <w:rPr>
           <w:b/>
-          <w:color w:val="777777"/>
+          <w:color w:val="888888"/>
           <w:sz w:val="18"/>
         </w:rPr>
         <w:t xml:space="preserve">[74]  </w:t>
@@ -1743,13 +1614,12 @@
     </w:p>
     <w:p>
       <w:pPr>
-        <w:spacing w:before="20" w:after="60"/>
-        <w:ind w:left="283"/>
+        <w:spacing w:before="20" w:after="20"/>
       </w:pPr>
       <w:r>
         <w:rPr>
           <w:b/>
-          <w:color w:val="777777"/>
+          <w:color w:val="888888"/>
           <w:sz w:val="18"/>
         </w:rPr>
         <w:t xml:space="preserve">[75]  </w:t>
@@ -1763,13 +1633,12 @@
     </w:p>
     <w:p>
       <w:pPr>
-        <w:spacing w:before="20" w:after="60"/>
-        <w:ind w:left="283"/>
+        <w:spacing w:before="20" w:after="20"/>
       </w:pPr>
       <w:r>
         <w:rPr>
           <w:b/>
-          <w:color w:val="777777"/>
+          <w:color w:val="888888"/>
           <w:sz w:val="18"/>
         </w:rPr>
         <w:t xml:space="preserve">[76]  </w:t>
@@ -1783,13 +1652,12 @@
     </w:p>
     <w:p>
       <w:pPr>
-        <w:spacing w:before="20" w:after="60"/>
-        <w:ind w:left="283"/>
+        <w:spacing w:before="20" w:after="20"/>
       </w:pPr>
       <w:r>
         <w:rPr>
           <w:b/>
-          <w:color w:val="777777"/>
+          <w:color w:val="888888"/>
           <w:sz w:val="18"/>
         </w:rPr>
         <w:t xml:space="preserve">[77]  </w:t>
@@ -1803,13 +1671,12 @@
     </w:p>
     <w:p>
       <w:pPr>
-        <w:spacing w:before="20" w:after="60"/>
-        <w:ind w:left="283"/>
+        <w:spacing w:before="20" w:after="20"/>
       </w:pPr>
       <w:r>
         <w:rPr>
           <w:b/>
-          <w:color w:val="777777"/>
+          <w:color w:val="888888"/>
           <w:sz w:val="18"/>
         </w:rPr>
         <w:t xml:space="preserve">[78]  </w:t>
@@ -1823,13 +1690,12 @@
     </w:p>
     <w:p>
       <w:pPr>
-        <w:spacing w:before="20" w:after="60"/>
-        <w:ind w:left="283"/>
+        <w:spacing w:before="20" w:after="20"/>
       </w:pPr>
       <w:r>
         <w:rPr>
           <w:b/>
-          <w:color w:val="777777"/>
+          <w:color w:val="888888"/>
           <w:sz w:val="18"/>
         </w:rPr>
         <w:t xml:space="preserve">[79]  </w:t>
@@ -1843,13 +1709,12 @@
     </w:p>
     <w:p>
       <w:pPr>
-        <w:spacing w:before="20" w:after="60"/>
-        <w:ind w:left="283"/>
+        <w:spacing w:before="20" w:after="20"/>
       </w:pPr>
       <w:r>
         <w:rPr>
           <w:b/>
-          <w:color w:val="777777"/>
+          <w:color w:val="888888"/>
           <w:sz w:val="18"/>
         </w:rPr>
         <w:t xml:space="preserve">[80]  </w:t>
@@ -1863,13 +1728,12 @@
     </w:p>
     <w:p>
       <w:pPr>
-        <w:spacing w:before="20" w:after="60"/>
-        <w:ind w:left="283"/>
+        <w:spacing w:before="20" w:after="20"/>
       </w:pPr>
       <w:r>
         <w:rPr>
           <w:b/>
-          <w:color w:val="777777"/>
+          <w:color w:val="888888"/>
           <w:sz w:val="18"/>
         </w:rPr>
         <w:t xml:space="preserve">[81]  </w:t>
@@ -1883,13 +1747,12 @@
     </w:p>
     <w:p>
       <w:pPr>
-        <w:spacing w:before="20" w:after="60"/>
-        <w:ind w:left="283"/>
+        <w:spacing w:before="20" w:after="20"/>
       </w:pPr>
       <w:r>
         <w:rPr>
           <w:b/>
-          <w:color w:val="777777"/>
+          <w:color w:val="888888"/>
           <w:sz w:val="18"/>
         </w:rPr>
         <w:t xml:space="preserve">[82]  </w:t>
@@ -1903,13 +1766,12 @@
     </w:p>
     <w:p>
       <w:pPr>
-        <w:spacing w:before="20" w:after="60"/>
-        <w:ind w:left="283"/>
+        <w:spacing w:before="20" w:after="20"/>
       </w:pPr>
       <w:r>
         <w:rPr>
           <w:b/>
-          <w:color w:val="777777"/>
+          <w:color w:val="888888"/>
           <w:sz w:val="18"/>
         </w:rPr>
         <w:t xml:space="preserve">[83]  </w:t>
@@ -1923,13 +1785,12 @@
     </w:p>
     <w:p>
       <w:pPr>
-        <w:spacing w:before="20" w:after="60"/>
-        <w:ind w:left="283"/>
+        <w:spacing w:before="20" w:after="20"/>
       </w:pPr>
       <w:r>
         <w:rPr>
           <w:b/>
-          <w:color w:val="777777"/>
+          <w:color w:val="888888"/>
           <w:sz w:val="18"/>
         </w:rPr>
         <w:t xml:space="preserve">[84]  </w:t>
@@ -1941,28 +1802,28 @@
         <w:t>These five systems were designed for the world you actually live in.</w:t>
       </w:r>
     </w:p>
+    <w:p/>
     <w:p>
       <w:pPr>
-        <w:spacing w:before="240" w:after="40"/>
+        <w:spacing w:before="280" w:after="80"/>
       </w:pPr>
       <w:r>
         <w:rPr>
           <w:b/>
           <w:color w:val="B02A2A"/>
-          <w:sz w:val="20"/>
+          <w:sz w:val="22"/>
         </w:rPr>
-        <w:t>── IDENTITY CLOSE ──</w:t>
+        <w:t>— IDENTITY CLOSE —</w:t>
       </w:r>
     </w:p>
     <w:p>
       <w:pPr>
-        <w:spacing w:before="20" w:after="60"/>
-        <w:ind w:left="283"/>
+        <w:spacing w:before="20" w:after="20"/>
       </w:pPr>
       <w:r>
         <w:rPr>
           <w:b/>
-          <w:color w:val="777777"/>
+          <w:color w:val="888888"/>
           <w:sz w:val="18"/>
         </w:rPr>
         <w:t xml:space="preserve">[85]  </w:t>
@@ -1976,13 +1837,12 @@
     </w:p>
     <w:p>
       <w:pPr>
-        <w:spacing w:before="20" w:after="60"/>
-        <w:ind w:left="283"/>
+        <w:spacing w:before="20" w:after="20"/>
       </w:pPr>
       <w:r>
         <w:rPr>
           <w:b/>
-          <w:color w:val="777777"/>
+          <w:color w:val="888888"/>
           <w:sz w:val="18"/>
         </w:rPr>
         <w:t xml:space="preserve">[86]  </w:t>
@@ -1996,13 +1856,12 @@
     </w:p>
     <w:p>
       <w:pPr>
-        <w:spacing w:before="20" w:after="60"/>
-        <w:ind w:left="283"/>
+        <w:spacing w:before="20" w:after="20"/>
       </w:pPr>
       <w:r>
         <w:rPr>
           <w:b/>
-          <w:color w:val="777777"/>
+          <w:color w:val="888888"/>
           <w:sz w:val="18"/>
         </w:rPr>
         <w:t xml:space="preserve">[87]  </w:t>
@@ -2016,13 +1875,12 @@
     </w:p>
     <w:p>
       <w:pPr>
-        <w:spacing w:before="20" w:after="60"/>
-        <w:ind w:left="283"/>
+        <w:spacing w:before="20" w:after="20"/>
       </w:pPr>
       <w:r>
         <w:rPr>
           <w:b/>
-          <w:color w:val="777777"/>
+          <w:color w:val="888888"/>
           <w:sz w:val="18"/>
         </w:rPr>
         <w:t xml:space="preserve">[88]  </w:t>
@@ -2036,13 +1894,12 @@
     </w:p>
     <w:p>
       <w:pPr>
-        <w:spacing w:before="20" w:after="60"/>
-        <w:ind w:left="283"/>
+        <w:spacing w:before="20" w:after="20"/>
       </w:pPr>
       <w:r>
         <w:rPr>
           <w:b/>
-          <w:color w:val="777777"/>
+          <w:color w:val="888888"/>
           <w:sz w:val="18"/>
         </w:rPr>
         <w:t xml:space="preserve">[89]  </w:t>
@@ -2056,13 +1913,12 @@
     </w:p>
     <w:p>
       <w:pPr>
-        <w:spacing w:before="20" w:after="60"/>
-        <w:ind w:left="283"/>
+        <w:spacing w:before="20" w:after="20"/>
       </w:pPr>
       <w:r>
         <w:rPr>
           <w:b/>
-          <w:color w:val="777777"/>
+          <w:color w:val="888888"/>
           <w:sz w:val="18"/>
         </w:rPr>
         <w:t xml:space="preserve">[90]  </w:t>
@@ -2076,13 +1932,12 @@
     </w:p>
     <w:p>
       <w:pPr>
-        <w:spacing w:before="20" w:after="60"/>
-        <w:ind w:left="283"/>
+        <w:spacing w:before="20" w:after="20"/>
       </w:pPr>
       <w:r>
         <w:rPr>
           <w:b/>
-          <w:color w:val="777777"/>
+          <w:color w:val="888888"/>
           <w:sz w:val="18"/>
         </w:rPr>
         <w:t xml:space="preserve">[91]  </w:t>
@@ -2094,28 +1949,28 @@
         <w:t>Now you know which five. That's the first thing the Villain didn't want you to have.</w:t>
       </w:r>
     </w:p>
+    <w:p/>
     <w:p>
       <w:pPr>
-        <w:spacing w:before="240" w:after="40"/>
+        <w:spacing w:before="280" w:after="80"/>
       </w:pPr>
       <w:r>
         <w:rPr>
           <w:b/>
           <w:color w:val="B02A2A"/>
-          <w:sz w:val="20"/>
+          <w:sz w:val="22"/>
         </w:rPr>
-        <w:t>── NEXT VIDEO TEASE ──</w:t>
+        <w:t>— NEXT VIDEO TEASE —</w:t>
       </w:r>
     </w:p>
     <w:p>
       <w:pPr>
-        <w:spacing w:before="20" w:after="60"/>
-        <w:ind w:left="283"/>
+        <w:spacing w:before="20" w:after="20"/>
       </w:pPr>
       <w:r>
         <w:rPr>
           <w:b/>
-          <w:color w:val="777777"/>
+          <w:color w:val="888888"/>
           <w:sz w:val="18"/>
         </w:rPr>
         <w:t xml:space="preserve">[92]  </w:t>
@@ -2129,13 +1984,12 @@
     </w:p>
     <w:p>
       <w:pPr>
-        <w:spacing w:before="20" w:after="60"/>
-        <w:ind w:left="283"/>
+        <w:spacing w:before="20" w:after="20"/>
       </w:pPr>
       <w:r>
         <w:rPr>
           <w:b/>
-          <w:color w:val="777777"/>
+          <w:color w:val="888888"/>
           <w:sz w:val="18"/>
         </w:rPr>
         <w:t xml:space="preserve">[93]  </w:t>
@@ -2149,13 +2003,12 @@
     </w:p>
     <w:p>
       <w:pPr>
-        <w:spacing w:before="20" w:after="60"/>
-        <w:ind w:left="283"/>
+        <w:spacing w:before="20" w:after="20"/>
       </w:pPr>
       <w:r>
         <w:rPr>
           <w:b/>
-          <w:color w:val="777777"/>
+          <w:color w:val="888888"/>
           <w:sz w:val="18"/>
         </w:rPr>
         <w:t xml:space="preserve">[94]  </w:t>
@@ -2169,13 +2022,12 @@
     </w:p>
     <w:p>
       <w:pPr>
-        <w:spacing w:before="20" w:after="60"/>
-        <w:ind w:left="283"/>
+        <w:spacing w:before="20" w:after="20"/>
       </w:pPr>
       <w:r>
         <w:rPr>
           <w:b/>
-          <w:color w:val="777777"/>
+          <w:color w:val="888888"/>
           <w:sz w:val="18"/>
         </w:rPr>
         <w:t xml:space="preserve">[95]  </w:t>
@@ -2185,6 +2037,19 @@
           <w:sz w:val="22"/>
         </w:rPr>
         <w:t>See you Thursday.</w:t>
+      </w:r>
+    </w:p>
+    <w:p/>
+    <w:p>
+      <w:pPr>
+        <w:jc w:val="center"/>
+      </w:pPr>
+      <w:r>
+        <w:rPr>
+          <w:color w:val="666666"/>
+          <w:sz w:val="18"/>
+        </w:rPr>
+        <w:t>TOTAL: 95 beats · ~798 words · ~6 min</w:t>
       </w:r>
     </w:p>
     <w:sectPr>
@@ -2562,7 +2427,7 @@
     <w:rsid w:val="00FC693F"/>
     <w:rPr>
       <w:rFonts w:ascii="Calibri" w:hAnsi="Calibri"/>
-      <w:sz w:val="20"/>
+      <w:sz w:val="22"/>
     </w:rPr>
   </w:style>
   <w:style w:type="paragraph" w:styleId="Header">

</xml_diff>